<commit_message>
Optional abstract v2: verified facts, under 500 words
Co-Authored-By: Claude Sonnet 5.5 <noreply@anthropic.com>
Claude-Session: https://claude.ai/code/session_01BZjJPdbxvnVxMrcgFoYMCh
</commit_message>
<xml_diff>
--- a/misq_si/MISQ_SI_Optional_Abstract_v2_DRAFT.docx
+++ b/misq_si/MISQ_SI_Optional_Abstract_v2_DRAFT.docx
@@ -60,7 +60,7 @@
           <w:b w:val="0"/>
           <w:i w:val="0"/>
         </w:rPr>
-        <w:t xml:space="preserve"> South Korea is commonly described as a country that won its democracy through its own mobilization (the 1987 democratic struggle [verify]) and that later invested heavily in national information infrastructure, including broadband and e-government [verify programs and dates]. In this setting digital infrastructure is not only a technical or commercial asset. Public reactions to major service failures, such as the 2022 data-center fire that disrupted a dominant messaging platform [verify], and the use of petition and complaint channels suggest that citizens may treat infrastructure as something they are entitled to hold to account, as they once held the state to account [to be examined, not assumed].</w:t>
+        <w:t xml:space="preserve"> South Korea is commonly described as a country that won its democracy through its own mobilization (the June Democratic Struggle of 1987, which led to direct presidential elections) and that built national information infrastructure through a succession of state programs from the early 1990s, including Cyber Korea 21 in 1999 [confirm names, dates, budgets]. In this setting digital infrastructure is not only a technical or commercial asset. Public reactions to major service failures, such as the October 2022 fire at a data center that took down a dominant messaging platform and other services for about two days, after which a co-CEO resigned and the government tightened disaster-management duties for large operators [verify], and the use of petition and complaint channels suggest that citizens may treat infrastructure as something they are entitled to hold to account, as they once held the state to account [to be examined, not assumed].</w:t>
       </w:r>
     </w:p>
     <w:p>
@@ -80,7 +80,7 @@
           <w:b w:val="0"/>
           <w:i w:val="0"/>
         </w:rPr>
-        <w:t xml:space="preserve"> We do not claim that democratization caused economic growth. Most accounts date the high-growth period to the authoritarian developmental state and infrastructure expansion to the democratic period. Our interest is narrower and begins from the phenomenon: how a society with this history makes sense of, and acts on, the reliability and ownership of digital infrastructure.</w:t>
+        <w:t xml:space="preserve"> We do not claim that democratization caused economic growth. Standard accounts date the high-growth period to the authoritarian developmental state of the 1960s and 1970s and the main infrastructure programs to the democratic period. Our interest is narrower: how a society with this history makes sense of, and acts on, the reliability and ownership of digital infrastructure.</w:t>
       </w:r>
     </w:p>
     <w:p>
@@ -140,7 +140,7 @@
           <w:b w:val="0"/>
           <w:i w:val="0"/>
         </w:rPr>
-        <w:t xml:space="preserve"> An inductive, interpretive case study of [selected infrastructure failures and the responses to them], using public documents, regulatory and legislative records, media coverage, petition and complaint data where available, and [N] interviews with operators, regulators, firm staff and affected users [access to be secured by the author]. The categories above are starting points and will be dropped if the evidence does not support them. As a Discovery Short Paper, the contribution is a rich account of the phenomenon and the constructs that emerge from it.</w:t>
+        <w:t xml:space="preserve"> An inductive, interpretive case study of [selected infrastructure failures and the responses to them], using public documents, regulatory and legislative records, media coverage, petition and complaint data where available, and [N] interviews with operators, regulators, firm staff and affected users [access to be secured by the author]. The categories above are starting points, to be dropped if the evidence does not support them. As a Discovery Short Paper, the contribution is a rich account of the phenomenon and the constructs that emerge from it.</w:t>
       </w:r>
     </w:p>
     <w:p>
@@ -160,7 +160,7 @@
           <w:b w:val="0"/>
           <w:i w:val="0"/>
         </w:rPr>
-        <w:t xml:space="preserve"> We expect to propose one or more constructs describing how accountability for digital infrastructure is claimed and assigned in this setting [to be induced from data], and to state what they imply for theories of platform governance, infrastructure and the governance of AI-enabled services. We will not assume the constructs generalize, and we will say what the account means for existing theory so that it is more than description.</w:t>
+        <w:t xml:space="preserve"> We expect to propose one or more constructs describing how accountability for digital infrastructure is claimed and assigned in this setting [to be induced from data], and to state what they imply for theories of platform governance, infrastructure and the governance of AI-enabled services. We will not assume the constructs generalize and will state what it means for existing theory.</w:t>
       </w:r>
     </w:p>
     <w:sectPr>

</xml_diff>

<commit_message>
Optional abstract v2: center on social media in the 2024 martial-law response
Co-Authored-By: Claude Sonnet 5.5 <noreply@anthropic.com>
Claude-Session: https://claude.ai/code/session_01BZjJPdbxvnVxMrcgFoYMCh
</commit_message>
<xml_diff>
--- a/misq_si/MISQ_SI_Optional_Abstract_v2_DRAFT.docx
+++ b/misq_si/MISQ_SI_Optional_Abstract_v2_DRAFT.docx
@@ -13,7 +13,7 @@
           <w:i w:val="0"/>
           <w:sz w:val="30"/>
         </w:rPr>
-        <w:t>Infrastructure Citizens Hold to Account: Digital Infrastructure in a Society That Won Its Democracy</w:t>
+        <w:t>Infrastructure for Defending Democracy: Social Media and Citizens' Response to the 2024 Martial Law Declaration in Korea</w:t>
       </w:r>
     </w:p>
     <w:p>
@@ -27,7 +27,7 @@
           <w:i/>
           <w:sz w:val="20"/>
         </w:rPr>
-        <w:t>Optional abstract v2, MIS Quarterly Special Issue on Indigenous Theory Development  ·  Ook Lee, Hanyang University</w:t>
+        <w:t>Optional abstract v2 (revised), MIS Quarterly Special Issue on Indigenous Theory Development  ·  Ook Lee, Hanyang University</w:t>
       </w:r>
     </w:p>
     <w:p>
@@ -60,7 +60,7 @@
           <w:b w:val="0"/>
           <w:i w:val="0"/>
         </w:rPr>
-        <w:t xml:space="preserve"> South Korea is commonly described as a country that won its democracy through its own mobilization (the June Democratic Struggle of 1987, which led to direct presidential elections) and that built national information infrastructure through a succession of state programs from the early 1990s, including Cyber Korea 21 in 1999 [confirm names, dates, budgets]. In this setting digital infrastructure is not only a technical or commercial asset. Public reactions to major service failures, such as the October 2022 fire at a data center that took down a dominant messaging platform and other services for about two days, after which a co-CEO resigned and the government tightened disaster-management duties for large operators [verify], and the use of petition and complaint channels suggest that citizens may treat infrastructure as something they are entitled to hold to account, as they once held the state to account [to be examined, not assumed].</w:t>
+        <w:t xml:space="preserve"> South Korea won its democracy through mass mobilization (the June Democratic Struggle of 1987) and, from the early 1990s, built national information infrastructure through successive state programs [confirm names and dates]. On the night of 3 December 2024, the president declared emergency martial law in a televised address at about 10:30 p.m. Citizens converged on the National Assembly through the night, and shortly after 1 a.m. the Assembly voted 190 to 0 to overturn the decree [verify]. Accounts of that night give prominent roles to live-streamed video, rapid sharing on social media and online communities, and the real-time broadcast of troop movements [verify and source each claim]. The president was impeached on 14 December and removed by the Constitutional Court on 4 April 2025 [verify].</w:t>
       </w:r>
     </w:p>
     <w:p>
@@ -73,14 +73,14 @@
           <w:b/>
           <w:i w:val="0"/>
         </w:rPr>
-        <w:t>What we do not claim.</w:t>
+        <w:t>What we do and do not claim.</w:t>
       </w:r>
       <w:r>
         <w:rPr>
           <w:b w:val="0"/>
           <w:i w:val="0"/>
         </w:rPr>
-        <w:t xml:space="preserve"> We do not claim that democratization caused economic growth. Standard accounts date the high-growth period to the authoritarian developmental state of the 1960s and 1970s and the main infrastructure programs to the democratic period. Our interest is narrower: how a society with this history makes sense of, and acts on, the reliability and ownership of digital infrastructure.</w:t>
+        <w:t xml:space="preserve"> We treat the contribution of social media to the citizens' response as the central phenomenon to explain, not as an established cause. Other factors, including the Assembly's procedures, the conduct of security forces, journalists and political leaders, plausibly mattered. We do not claim that democratization caused economic growth: standard accounts place high growth under the earlier authoritarian developmental state. We also take no political position on the events. The study is analytic.</w:t>
       </w:r>
     </w:p>
     <w:p>
@@ -100,7 +100,7 @@
           <w:b w:val="0"/>
           <w:i w:val="0"/>
         </w:rPr>
-        <w:t xml:space="preserve"> IS research on infrastructure, platforms and outages mostly draws on frames of service quality, platform governance and market competition. If accountability for infrastructure in Korea is shaped by collective memory of a struggle for rights, then these frames describe the setting only by importing assumptions about users as customers. We start from practitioners' and citizens' own categories, such as how outages are described, who is said to be responsible, and what remedies are demanded [terms to be gathered from the field].</w:t>
+        <w:t xml:space="preserve"> IS and communication research on digital collective action often draws on frames developed in other settings, such as connective action and protest organizing on social platforms. The Korean case joins three conditions that these frames treat separately: a collective memory of winning democracy, dense and widely used digital infrastructure, and a constitutional mechanism through which a legislative vote could end the decree within hours. We therefore begin from participants' own categories and accounts [terms to be gathered].</w:t>
       </w:r>
     </w:p>
     <w:p>
@@ -120,7 +120,7 @@
           <w:b w:val="0"/>
           <w:i w:val="0"/>
         </w:rPr>
-        <w:t xml:space="preserve"> (1) When major digital services fail, who is held responsible, by whom, and in what language? (2) How do citizens, firms, regulators and the press connect infrastructure to rights and obligations? (3) What concepts, grounded in these accounts, are needed to explain the resulting practices?</w:t>
+        <w:t xml:space="preserve"> (1) Through which channels did information, coordination and verification occur that night, and how did participants rely on them? (2) How did participants link their action to the history of democratization and to the infrastructure they used? (3) What concepts, grounded in these accounts, are needed to explain rapid collective action to defend an institution?</w:t>
       </w:r>
     </w:p>
     <w:p>
@@ -140,7 +140,7 @@
           <w:b w:val="0"/>
           <w:i w:val="0"/>
         </w:rPr>
-        <w:t xml:space="preserve"> An inductive, interpretive case study of [selected infrastructure failures and the responses to them], using public documents, regulatory and legislative records, media coverage, petition and complaint data where available, and [N] interviews with operators, regulators, firm staff and affected users [access to be secured by the author]. The categories above are starting points, to be dropped if the evidence does not support them. As a Discovery Short Paper, the contribution is a rich account of the phenomenon and the constructs that emerge from it.</w:t>
+        <w:t xml:space="preserve"> An inductive, interpretive study that reconstructs the timeline from archived live streams, public posts, media records and official records, and draws on [N] interviews with participants, streamers, journalists and officials [access and ethical approval to be secured; protection of participants' identities is essential]. The categories above are starting points, to be dropped if the evidence does not support them. As a Discovery Short Paper, the contribution is a rich account of the phenomenon and the constructs that emerge from it.</w:t>
       </w:r>
     </w:p>
     <w:p>
@@ -160,7 +160,7 @@
           <w:b w:val="0"/>
           <w:i w:val="0"/>
         </w:rPr>
-        <w:t xml:space="preserve"> We expect to propose one or more constructs describing how accountability for digital infrastructure is claimed and assigned in this setting [to be induced from data], and to state what they imply for theories of platform governance, infrastructure and the governance of AI-enabled services. We will not assume the constructs generalize and will state what it means for existing theory.</w:t>
+        <w:t xml:space="preserve"> We expect to propose one or more constructs describing how digital infrastructure, historical memory and institutions combine to enable rapid collective defense of an institution [to be induced from data], and to state what they imply for theories of digital collective action and infrastructure. We will not assume the constructs generalize.</w:t>
       </w:r>
     </w:p>
     <w:sectPr>

</xml_diff>

<commit_message>
Abstract v2: add will-infrastructure complementarity conjecture and cross-episode comparison
Co-Authored-By: Claude Sonnet 5.5 <noreply@anthropic.com>
Claude-Session: https://claude.ai/code/session_01BZjJPdbxvnVxMrcgFoYMCh
</commit_message>
<xml_diff>
--- a/misq_si/MISQ_SI_Optional_Abstract_v2_DRAFT.docx
+++ b/misq_si/MISQ_SI_Optional_Abstract_v2_DRAFT.docx
@@ -60,7 +60,7 @@
           <w:b w:val="0"/>
           <w:i w:val="0"/>
         </w:rPr>
-        <w:t xml:space="preserve"> South Korea won its democracy through mass mobilization (the June Democratic Struggle of 1987) and, from the early 1990s, built national information infrastructure through successive state programs [confirm names and dates]. On the night of 3 December 2024, the president declared emergency martial law in a televised address at about 10:30 p.m. Citizens converged on the National Assembly through the night, and shortly after 1 a.m. the Assembly voted 190 to 0 to overturn the decree [verify]. Accounts of that night give prominent roles to live-streamed video, rapid sharing on social media and online communities, and the real-time broadcast of troop movements [verify and source each claim]. The president was impeached on 14 December and removed by the Constitutional Court on 4 April 2025 [verify].</w:t>
+        <w:t xml:space="preserve"> South Korea won its democracy through mass mobilization (the June Democratic Struggle of 1987) and, from the early 1990s, built national information infrastructure through successive state programs [confirm names and dates]. On the night of 3 December 2024, the president declared emergency martial law in a televised address at about 10:30 p.m. Citizens converged on the National Assembly through the night, and shortly after 1 a.m. the Assembly voted 190 to 0 to overturn the decree [verify]. Accounts of that night give prominent roles to live-streamed video, rapid sharing on social media and online communities, and the real-time broadcast of troop movements [verify and source each claim].</w:t>
       </w:r>
     </w:p>
     <w:p>
@@ -73,14 +73,14 @@
           <w:b/>
           <w:i w:val="0"/>
         </w:rPr>
-        <w:t>What we do and do not claim.</w:t>
+        <w:t>Conjecture and what we do not claim.</w:t>
       </w:r>
       <w:r>
         <w:rPr>
           <w:b w:val="0"/>
           <w:i w:val="0"/>
         </w:rPr>
-        <w:t xml:space="preserve"> We treat the contribution of social media to the citizens' response as the central phenomenon to explain, not as an established cause. Other factors, including the Assembly's procedures, the conduct of security forces, journalists and political leaders, plausibly mattered. We do not claim that democratization caused economic growth: standard accounts place high growth under the earlier authoritarian developmental state. We also take no political position on the events. The study is analytic.</w:t>
+        <w:t xml:space="preserve"> Our starting conjecture is that the speed and scale of the response reflect the combination of a strong, historically formed popular commitment to democracy and unusually dense, widely used digital infrastructure, and that each is weak without the other. We treat this as a proposition to examine, not an established cause. Other factors, such as the Assembly's procedures and the conduct of security forces and journalists, plausibly mattered. We do not label the episode a revolution; whether that term fits is part of the question. We do not claim that democratization caused economic growth, since standard accounts place high growth under the earlier authoritarian developmental state. We take no political position on the events.</w:t>
       </w:r>
     </w:p>
     <w:p>
@@ -100,7 +100,7 @@
           <w:b w:val="0"/>
           <w:i w:val="0"/>
         </w:rPr>
-        <w:t xml:space="preserve"> IS and communication research on digital collective action often draws on frames developed in other settings, such as connective action and protest organizing on social platforms. The Korean case joins three conditions that these frames treat separately: a collective memory of winning democracy, dense and widely used digital infrastructure, and a constitutional mechanism through which a legislative vote could end the decree within hours. We therefore begin from participants' own categories and accounts [terms to be gathered].</w:t>
+        <w:t xml:space="preserve"> IS and communication research on digital collective action often draws on frames developed in other settings. The Korean case joins three conditions that these frames treat separately: a collective memory of winning democracy, dense and widely used digital infrastructure, and a constitutional mechanism through which a legislative vote could end the decree within hours. We therefore begin from participants' own accounts [terms to be gathered].</w:t>
       </w:r>
     </w:p>
     <w:p>
@@ -120,7 +120,7 @@
           <w:b w:val="0"/>
           <w:i w:val="0"/>
         </w:rPr>
-        <w:t xml:space="preserve"> (1) Through which channels did information, coordination and verification occur that night, and how did participants rely on them? (2) How did participants link their action to the history of democratization and to the infrastructure they used? (3) What concepts, grounded in these accounts, are needed to explain rapid collective action to defend an institution?</w:t>
+        <w:t xml:space="preserve"> (1) Through which channels did information, coordination and verification occur that night? (2) Does mobilization speed differ across episodes with similar commitment but different infrastructure, namely 1987 (about three weeks to the June 29 concession), the 2016–17 candlelight protests, and 2024 (hours) [verify durations]? (3) How did participants link their action to the history of democratization and to the infrastructure they used? (4) What concepts, grounded in these accounts, are needed to explain rapid collective action to defend an institution?</w:t>
       </w:r>
     </w:p>
     <w:p>
@@ -140,7 +140,7 @@
           <w:b w:val="0"/>
           <w:i w:val="0"/>
         </w:rPr>
-        <w:t xml:space="preserve"> An inductive, interpretive study that reconstructs the timeline from archived live streams, public posts, media records and official records, and draws on [N] interviews with participants, streamers, journalists and officials [access and ethical approval to be secured; protection of participants' identities is essential]. The categories above are starting points, to be dropped if the evidence does not support them. As a Discovery Short Paper, the contribution is a rich account of the phenomenon and the constructs that emerge from it.</w:t>
+        <w:t xml:space="preserve"> An inductive, interpretive study that reconstructs the timeline from archived live streams, public posts, media records and official records, and draws on [N] interviews with participants, streamers, journalists and officials [access and ethical approval to be secured; protection of participants' identities is essential]. The categories above are provisional. As a Discovery Short Paper, the contribution is a rich account of the phenomenon and the constructs that emerge from it.</w:t>
       </w:r>
     </w:p>
     <w:p>
@@ -160,7 +160,7 @@
           <w:b w:val="0"/>
           <w:i w:val="0"/>
         </w:rPr>
-        <w:t xml:space="preserve"> We expect to propose one or more constructs describing how digital infrastructure, historical memory and institutions combine to enable rapid collective defense of an institution [to be induced from data], and to state what they imply for theories of digital collective action and infrastructure. We will not assume the constructs generalize.</w:t>
+        <w:t xml:space="preserve"> We expect to propose one or more constructs describing how digital infrastructure, historical memory and institutions combine to enable rapid collective defense of an institution [to be induced from data], and to state what they imply for theories of digital collective action and infrastructure.</w:t>
       </w:r>
     </w:p>
     <w:sectPr>

</xml_diff>